<commit_message>
Scoring system raw  update and demo bug fixed
</commit_message>
<xml_diff>
--- a/data/demo/sample_package/tailored_resume.docx
+++ b/data/demo/sample_package/tailored_resume.docx
@@ -7,19 +7,7 @@
         <w:pStyle w:val="Heading1"/>
       </w:pPr>
       <w:r>
-        <w:t>Demo Tailored Resume</w:t>
-      </w:r>
-    </w:p>
-    <w:p>
-      <w:pPr>
-        <w:spacing w:after="60" w:line="240" w:lineRule="auto"/>
-      </w:pPr>
-      <w:r>
-        <w:rPr>
-          <w:rFonts w:ascii="Calibri" w:hAnsi="Calibri"/>
-          <w:sz w:val="21"/>
-        </w:rPr>
-        <w:t>This is sanitized demo content. Replace it with a real resume source before using the application package workflow for an actual job.</w:t>
+        <w:t>Demo Candidate</w:t>
       </w:r>
     </w:p>
     <w:p>
@@ -39,7 +27,7 @@
           <w:rFonts w:ascii="Calibri" w:hAnsi="Calibri"/>
           <w:sz w:val="21"/>
         </w:rPr>
-        <w:t>Candidate with experience in Python data analysis, model evaluation, and clear technical communication. Interested in applied machine learning and analytics roles.</w:t>
+        <w:t>Candidate with experience in Python-based data analysis, machine learning model evaluation, technical communication, and applied project work. Experienced in translating job requirements into evidence-backed resume sections while preserving factual source material.</w:t>
       </w:r>
     </w:p>
     <w:p>
@@ -47,7 +35,19 @@
         <w:pStyle w:val="Heading2"/>
       </w:pPr>
       <w:r>
-        <w:t>Selected Skills</w:t>
+        <w:t>Education</w:t>
+      </w:r>
+    </w:p>
+    <w:p>
+      <w:pPr>
+        <w:spacing w:after="60" w:line="240" w:lineRule="auto"/>
+      </w:pPr>
+      <w:r>
+        <w:rPr>
+          <w:rFonts w:ascii="Calibri" w:hAnsi="Calibri"/>
+          <w:sz w:val="21"/>
+        </w:rPr>
+        <w:t>Bachelor's degree in Data Science, Fictional Technical College</w:t>
       </w:r>
     </w:p>
     <w:p>
@@ -60,7 +60,15 @@
           <w:rFonts w:ascii="Calibri" w:hAnsi="Calibri"/>
           <w:sz w:val="21"/>
         </w:rPr>
-        <w:t>Python, pandas, NumPy</w:t>
+        <w:t>Coursework included statistics, machine learning, databases, and data visualization.</w:t>
+      </w:r>
+    </w:p>
+    <w:p>
+      <w:pPr>
+        <w:pStyle w:val="Heading2"/>
+      </w:pPr>
+      <w:r>
+        <w:t>Technical Skills</w:t>
       </w:r>
     </w:p>
     <w:p>
@@ -73,7 +81,7 @@
           <w:rFonts w:ascii="Calibri" w:hAnsi="Calibri"/>
           <w:sz w:val="21"/>
         </w:rPr>
-        <w:t>Machine learning model evaluation</w:t>
+        <w:t>Python</w:t>
       </w:r>
     </w:p>
     <w:p>
@@ -86,7 +94,7 @@
           <w:rFonts w:ascii="Calibri" w:hAnsi="Calibri"/>
           <w:sz w:val="21"/>
         </w:rPr>
-        <w:t>Data visualization and reporting</w:t>
+        <w:t>statistics and data analysis</w:t>
       </w:r>
     </w:p>
     <w:p>
@@ -99,7 +107,216 @@
           <w:rFonts w:ascii="Calibri" w:hAnsi="Calibri"/>
           <w:sz w:val="21"/>
         </w:rPr>
-        <w:t>Technical writing and stakeholder communication</w:t>
+        <w:t>machine learning and model evaluation</w:t>
+      </w:r>
+    </w:p>
+    <w:p>
+      <w:pPr>
+        <w:pStyle w:val="ListBullet"/>
+        <w:spacing w:after="40" w:line="240" w:lineRule="auto"/>
+      </w:pPr>
+      <w:r>
+        <w:rPr>
+          <w:rFonts w:ascii="Calibri" w:hAnsi="Calibri"/>
+          <w:sz w:val="21"/>
+        </w:rPr>
+        <w:t>documentation and stakeholder communication</w:t>
+      </w:r>
+    </w:p>
+    <w:p>
+      <w:pPr>
+        <w:pStyle w:val="ListBullet"/>
+        <w:spacing w:after="40" w:line="240" w:lineRule="auto"/>
+      </w:pPr>
+      <w:r>
+        <w:rPr>
+          <w:rFonts w:ascii="Calibri" w:hAnsi="Calibri"/>
+          <w:sz w:val="21"/>
+        </w:rPr>
+        <w:t>pandas and NumPy</w:t>
+      </w:r>
+    </w:p>
+    <w:p>
+      <w:pPr>
+        <w:pStyle w:val="ListBullet"/>
+        <w:spacing w:after="40" w:line="240" w:lineRule="auto"/>
+      </w:pPr>
+      <w:r>
+        <w:rPr>
+          <w:rFonts w:ascii="Calibri" w:hAnsi="Calibri"/>
+          <w:sz w:val="21"/>
+        </w:rPr>
+        <w:t>scikit-learn</w:t>
+      </w:r>
+    </w:p>
+    <w:p>
+      <w:pPr>
+        <w:pStyle w:val="ListBullet"/>
+        <w:spacing w:after="40" w:line="240" w:lineRule="auto"/>
+      </w:pPr>
+      <w:r>
+        <w:rPr>
+          <w:rFonts w:ascii="Calibri" w:hAnsi="Calibri"/>
+          <w:sz w:val="21"/>
+        </w:rPr>
+        <w:t>data visualization with matplotlib</w:t>
+      </w:r>
+    </w:p>
+    <w:p>
+      <w:pPr>
+        <w:pStyle w:val="ListBullet"/>
+        <w:spacing w:after="40" w:line="240" w:lineRule="auto"/>
+      </w:pPr>
+      <w:r>
+        <w:rPr>
+          <w:rFonts w:ascii="Calibri" w:hAnsi="Calibri"/>
+          <w:sz w:val="21"/>
+        </w:rPr>
+        <w:t>SQL</w:t>
+      </w:r>
+    </w:p>
+    <w:p>
+      <w:pPr>
+        <w:pStyle w:val="Heading2"/>
+      </w:pPr>
+      <w:r>
+        <w:t>Experience</w:t>
+      </w:r>
+    </w:p>
+    <w:p>
+      <w:pPr>
+        <w:pStyle w:val="Heading3"/>
+      </w:pPr>
+      <w:r>
+        <w:t>Data Analysis Intern, Fictional Community Research Lab</w:t>
+      </w:r>
+    </w:p>
+    <w:p>
+      <w:pPr>
+        <w:pStyle w:val="ListBullet"/>
+        <w:spacing w:after="40" w:line="240" w:lineRule="auto"/>
+      </w:pPr>
+      <w:r>
+        <w:rPr>
+          <w:rFonts w:ascii="Calibri" w:hAnsi="Calibri"/>
+          <w:sz w:val="21"/>
+        </w:rPr>
+        <w:t>Cleaned tabular datasets with Python, pandas, and SQL for an entry-level internship.</w:t>
+      </w:r>
+    </w:p>
+    <w:p>
+      <w:pPr>
+        <w:pStyle w:val="ListBullet"/>
+        <w:spacing w:after="40" w:line="240" w:lineRule="auto"/>
+      </w:pPr>
+      <w:r>
+        <w:rPr>
+          <w:rFonts w:ascii="Calibri" w:hAnsi="Calibri"/>
+          <w:sz w:val="21"/>
+        </w:rPr>
+        <w:t>Built recurring dashboards and data visualizations for a small project team.</w:t>
+      </w:r>
+    </w:p>
+    <w:p>
+      <w:pPr>
+        <w:pStyle w:val="ListBullet"/>
+        <w:spacing w:after="40" w:line="240" w:lineRule="auto"/>
+      </w:pPr>
+      <w:r>
+        <w:rPr>
+          <w:rFonts w:ascii="Calibri" w:hAnsi="Calibri"/>
+          <w:sz w:val="21"/>
+        </w:rPr>
+        <w:t>Documented quality checks and presented findings to non-technical stakeholders.</w:t>
+      </w:r>
+    </w:p>
+    <w:p>
+      <w:pPr>
+        <w:pStyle w:val="Heading2"/>
+      </w:pPr>
+      <w:r>
+        <w:t>Projects</w:t>
+      </w:r>
+    </w:p>
+    <w:p>
+      <w:pPr>
+        <w:pStyle w:val="Heading3"/>
+      </w:pPr>
+      <w:r>
+        <w:t>Classification Pipeline</w:t>
+      </w:r>
+    </w:p>
+    <w:p>
+      <w:pPr>
+        <w:pStyle w:val="ListBullet"/>
+        <w:spacing w:after="40" w:line="240" w:lineRule="auto"/>
+      </w:pPr>
+      <w:r>
+        <w:rPr>
+          <w:rFonts w:ascii="Calibri" w:hAnsi="Calibri"/>
+          <w:sz w:val="21"/>
+        </w:rPr>
+        <w:t>Built a classification pipeline with Python and scikit-learn.</w:t>
+      </w:r>
+    </w:p>
+    <w:p>
+      <w:pPr>
+        <w:pStyle w:val="ListBullet"/>
+        <w:spacing w:after="40" w:line="240" w:lineRule="auto"/>
+      </w:pPr>
+      <w:r>
+        <w:rPr>
+          <w:rFonts w:ascii="Calibri" w:hAnsi="Calibri"/>
+          <w:sz w:val="21"/>
+        </w:rPr>
+        <w:t>Evaluated models with cross-validation and summarized model evaluation results.</w:t>
+      </w:r>
+    </w:p>
+    <w:p>
+      <w:pPr>
+        <w:pStyle w:val="ListBullet"/>
+        <w:spacing w:after="40" w:line="240" w:lineRule="auto"/>
+      </w:pPr>
+      <w:r>
+        <w:rPr>
+          <w:rFonts w:ascii="Calibri" w:hAnsi="Calibri"/>
+          <w:sz w:val="21"/>
+        </w:rPr>
+        <w:t>Created charts explaining model performance and limitations.</w:t>
+      </w:r>
+    </w:p>
+    <w:p>
+      <w:pPr>
+        <w:pStyle w:val="Heading3"/>
+      </w:pPr>
+      <w:r>
+        <w:t>Public Data Dashboard</w:t>
+      </w:r>
+    </w:p>
+    <w:p>
+      <w:pPr>
+        <w:pStyle w:val="ListBullet"/>
+        <w:spacing w:after="40" w:line="240" w:lineRule="auto"/>
+      </w:pPr>
+      <w:r>
+        <w:rPr>
+          <w:rFonts w:ascii="Calibri" w:hAnsi="Calibri"/>
+          <w:sz w:val="21"/>
+        </w:rPr>
+        <w:t>Analyzed a fictional public dataset using SQL, Python, and statistics.</w:t>
+      </w:r>
+    </w:p>
+    <w:p>
+      <w:pPr>
+        <w:pStyle w:val="ListBullet"/>
+        <w:spacing w:after="40" w:line="240" w:lineRule="auto"/>
+      </w:pPr>
+      <w:r>
+        <w:rPr>
+          <w:rFonts w:ascii="Calibri" w:hAnsi="Calibri"/>
+          <w:sz w:val="21"/>
+        </w:rPr>
+        <w:t>Created a dashboard and concise written report for an academic project.</w:t>
       </w:r>
     </w:p>
     <w:sectPr>

</xml_diff>